<commit_message>
docs: apellido de Andrés Mateo Puentes, cliente Sexto Sentido Café & Brunch y sin número de grupo
Co-Authored-By: Claude Opus 5.5 <noreply@anthropic.com>
</commit_message>
<xml_diff>
--- a/docs/entrega-2do-corte/01_Plan_de_gestion_del_proyecto/Acta_de_Constitucion_Project_Charter_StockPot.docx
+++ b/docs/entrega-2do-corte/01_Plan_de_gestion_del_proyecto/Acta_de_Constitucion_Project_Charter_StockPot.docx
@@ -2334,7 +2334,7 @@
               <w:jc w:val="center"/>
             </w:pPr>
             <w:r>
-              <w:t xml:space="preserve">Andres Mateo  </w:t>
+              <w:t>Andrés Mateo Puentes</w:t>
             </w:r>
           </w:p>
           <w:p>
@@ -2342,7 +2342,7 @@
               <w:jc w:val="center"/>
             </w:pPr>
             <w:r>
-              <w:t xml:space="preserve">Jhorman </w:t>
+              <w:t>Jhorman Caballero</w:t>
             </w:r>
           </w:p>
         </w:tc>
@@ -3518,7 +3518,7 @@
               <w:rPr>
                 <w:rFonts w:eastAsia="Arial" w:cs="Calibri"/>
               </w:rPr>
-              <w:t>Restaurante (Cliente / Sponsor)</w:t>
+              <w:t>Restaurante Sexto Sentido Café &amp; Brunch (Cliente / Sponsor)</w:t>
             </w:r>
           </w:p>
         </w:tc>
@@ -5432,7 +5432,7 @@
         <w:br/>
         <w:t>Ángel David Rodríguez Vega                 Sponsor / Cliente</w:t>
         <w:br/>
-        <w:t>Project Manager</w:t>
+        <w:t>Project Manager                                   Sexto Sentido Café &amp; Brunch</w:t>
       </w:r>
     </w:p>
     <w:sectPr>

</xml_diff>